<commit_message>
Add Vivod v Otchet LR3
</commit_message>
<xml_diff>
--- a/Lr3/ИИкТ_25_ПОз_Кудрин_Роман_Алексеевич_ЛР3.docx
+++ b/Lr3/ИИкТ_25_ПОз_Кудрин_Роман_Алексеевич_ЛР3.docx
@@ -518,13 +518,7 @@
         <w:rPr>
           <w:rFonts w:ascii="Times New Roman" w:hAnsi="Times New Roman"/>
         </w:rPr>
-        <w:t>__</w:t>
-      </w:r>
-      <w:r>
-        <w:rPr>
-          <w:rFonts w:ascii="Times New Roman" w:hAnsi="Times New Roman"/>
-        </w:rPr>
-        <w:t>______________            ____</w:t>
+        <w:t>________________            ____</w:t>
       </w:r>
       <w:r>
         <w:rPr>
@@ -2470,12 +2464,9 @@
           <w:color w:val="000000"/>
           <w:sz w:val="24"/>
           <w:szCs w:val="24"/>
-          <w:lang w:val="en-US"/>
         </w:rPr>
         <w:t>1</w:t>
       </w:r>
-      <w:bookmarkStart w:id="0" w:name="_GoBack"/>
-      <w:bookmarkEnd w:id="0"/>
       <w:r>
         <w:rPr>
           <w:rFonts w:ascii="Times New Roman" w:hAnsi="Times New Roman" w:cs="Times New Roman"/>
@@ -2992,18 +2983,7 @@
           <w:sz w:val="24"/>
           <w:szCs w:val="24"/>
         </w:rPr>
-        <w:t xml:space="preserve"> изменения</w:t>
-      </w:r>
-      <w:r>
-        <w:rPr>
-          <w:rFonts w:ascii="Times New Roman" w:hAnsi="Times New Roman" w:cs="Times New Roman"/>
-          <w:bCs/>
-          <w:iCs/>
-          <w:color w:val="000000"/>
-          <w:sz w:val="24"/>
-          <w:szCs w:val="24"/>
-        </w:rPr>
-        <w:t>:</w:t>
+        <w:t xml:space="preserve"> изменения:</w:t>
       </w:r>
     </w:p>
     <w:p>
@@ -3011,15 +2991,13 @@
         <w:pStyle w:val="a3"/>
         <w:spacing w:line="240" w:lineRule="auto"/>
         <w:ind w:left="-207"/>
-        <w:jc w:val="center"/>
-        <w:rPr>
-          <w:rFonts w:ascii="Times New Roman" w:hAnsi="Times New Roman" w:cs="Times New Roman"/>
-          <w:bCs/>
-          <w:iCs/>
-          <w:color w:val="000000"/>
-          <w:sz w:val="24"/>
-          <w:szCs w:val="24"/>
-          <w:lang w:val="en-US"/>
+        <w:rPr>
+          <w:rFonts w:ascii="Times New Roman" w:hAnsi="Times New Roman" w:cs="Times New Roman"/>
+          <w:bCs/>
+          <w:iCs/>
+          <w:color w:val="000000"/>
+          <w:sz w:val="24"/>
+          <w:szCs w:val="24"/>
         </w:rPr>
       </w:pPr>
       <w:r>
@@ -3028,7 +3006,7 @@
           <w:lang w:eastAsia="ru-RU"/>
         </w:rPr>
         <w:drawing>
-          <wp:inline distT="0" distB="0" distL="0" distR="0" wp14:anchorId="61090832" wp14:editId="328C3F08">
+          <wp:inline distT="0" distB="0" distL="0" distR="0" wp14:anchorId="70DBFFF3" wp14:editId="42F6FB59">
             <wp:extent cx="5940425" cy="3519805"/>
             <wp:effectExtent l="0" t="0" r="3175" b="4445"/>
             <wp:docPr id="16" name="Рисунок 16"/>
@@ -3067,52 +3045,338 @@
     <w:p>
       <w:pPr>
         <w:pStyle w:val="a3"/>
+        <w:numPr>
+          <w:ilvl w:val="0"/>
+          <w:numId w:val="1"/>
+        </w:numPr>
         <w:spacing w:line="240" w:lineRule="auto"/>
-        <w:ind w:left="-207"/>
-        <w:jc w:val="center"/>
-        <w:rPr>
-          <w:rFonts w:ascii="Times New Roman" w:hAnsi="Times New Roman" w:cs="Times New Roman"/>
-          <w:bCs/>
-          <w:iCs/>
-          <w:color w:val="000000"/>
-          <w:sz w:val="24"/>
-          <w:szCs w:val="24"/>
-        </w:rPr>
-      </w:pPr>
+        <w:rPr>
+          <w:rFonts w:ascii="Times New Roman" w:hAnsi="Times New Roman" w:cs="Times New Roman"/>
+          <w:bCs/>
+          <w:iCs/>
+          <w:color w:val="000000"/>
+          <w:sz w:val="24"/>
+          <w:szCs w:val="24"/>
+        </w:rPr>
+      </w:pPr>
+      <w:r>
+        <w:rPr>
+          <w:rFonts w:ascii="Times New Roman" w:hAnsi="Times New Roman" w:cs="Times New Roman"/>
+          <w:bCs/>
+          <w:iCs/>
+          <w:color w:val="000000"/>
+          <w:sz w:val="24"/>
+          <w:szCs w:val="24"/>
+        </w:rPr>
+        <w:t xml:space="preserve">Добавил отчет по лабораторной работе в папку </w:t>
+      </w:r>
+      <w:proofErr w:type="spellStart"/>
+      <w:r>
+        <w:rPr>
+          <w:rFonts w:ascii="Times New Roman" w:hAnsi="Times New Roman" w:cs="Times New Roman"/>
+          <w:bCs/>
+          <w:iCs/>
+          <w:color w:val="000000"/>
+          <w:sz w:val="24"/>
+          <w:szCs w:val="24"/>
+          <w:lang w:val="en-US"/>
+        </w:rPr>
+        <w:t>Lr</w:t>
+      </w:r>
+      <w:proofErr w:type="spellEnd"/>
+      <w:r>
+        <w:rPr>
+          <w:rFonts w:ascii="Times New Roman" w:hAnsi="Times New Roman" w:cs="Times New Roman"/>
+          <w:bCs/>
+          <w:iCs/>
+          <w:color w:val="000000"/>
+          <w:sz w:val="24"/>
+          <w:szCs w:val="24"/>
+        </w:rPr>
+        <w:t>3</w:t>
+      </w:r>
     </w:p>
     <w:p>
       <w:pPr>
         <w:pStyle w:val="a3"/>
         <w:spacing w:line="240" w:lineRule="auto"/>
         <w:ind w:left="-207"/>
-        <w:jc w:val="center"/>
-        <w:rPr>
-          <w:rFonts w:ascii="Times New Roman" w:hAnsi="Times New Roman" w:cs="Times New Roman"/>
-          <w:bCs/>
-          <w:iCs/>
-          <w:color w:val="000000"/>
-          <w:sz w:val="24"/>
-          <w:szCs w:val="24"/>
-        </w:rPr>
-      </w:pPr>
+        <w:rPr>
+          <w:rFonts w:ascii="Times New Roman" w:hAnsi="Times New Roman" w:cs="Times New Roman"/>
+          <w:bCs/>
+          <w:iCs/>
+          <w:color w:val="000000"/>
+          <w:sz w:val="24"/>
+          <w:szCs w:val="24"/>
+        </w:rPr>
+      </w:pPr>
+      <w:r>
+        <w:rPr>
+          <w:rFonts w:ascii="Times New Roman" w:hAnsi="Times New Roman" w:cs="Times New Roman"/>
+          <w:bCs/>
+          <w:iCs/>
+          <w:color w:val="000000"/>
+          <w:sz w:val="24"/>
+          <w:szCs w:val="24"/>
+        </w:rPr>
+        <w:t xml:space="preserve"> </w:t>
+      </w:r>
+      <w:r>
+        <w:rPr>
+          <w:noProof/>
+          <w:lang w:eastAsia="ru-RU"/>
+        </w:rPr>
+        <w:drawing>
+          <wp:inline distT="0" distB="0" distL="0" distR="0" wp14:anchorId="56CB78A1" wp14:editId="3CD8476D">
+            <wp:extent cx="5940425" cy="3519805"/>
+            <wp:effectExtent l="0" t="0" r="3175" b="4445"/>
+            <wp:docPr id="5" name="Рисунок 5"/>
+            <wp:cNvGraphicFramePr>
+              <a:graphicFrameLocks xmlns:a="http://schemas.openxmlformats.org/drawingml/2006/main" noChangeAspect="1"/>
+            </wp:cNvGraphicFramePr>
+            <a:graphic xmlns:a="http://schemas.openxmlformats.org/drawingml/2006/main">
+              <a:graphicData uri="http://schemas.openxmlformats.org/drawingml/2006/picture">
+                <pic:pic xmlns:pic="http://schemas.openxmlformats.org/drawingml/2006/picture">
+                  <pic:nvPicPr>
+                    <pic:cNvPr id="1" name=""/>
+                    <pic:cNvPicPr/>
+                  </pic:nvPicPr>
+                  <pic:blipFill>
+                    <a:blip r:embed="rId18"/>
+                    <a:stretch>
+                      <a:fillRect/>
+                    </a:stretch>
+                  </pic:blipFill>
+                  <pic:spPr>
+                    <a:xfrm>
+                      <a:off x="0" y="0"/>
+                      <a:ext cx="5940425" cy="3519805"/>
+                    </a:xfrm>
+                    <a:prstGeom prst="rect">
+                      <a:avLst/>
+                    </a:prstGeom>
+                  </pic:spPr>
+                </pic:pic>
+              </a:graphicData>
+            </a:graphic>
+          </wp:inline>
+        </w:drawing>
+      </w:r>
+    </w:p>
+    <w:p>
+      <w:pPr>
+        <w:spacing w:after="160" w:line="259" w:lineRule="auto"/>
+        <w:rPr>
+          <w:rFonts w:ascii="Times New Roman" w:hAnsi="Times New Roman" w:cs="Times New Roman"/>
+          <w:bCs/>
+          <w:iCs/>
+          <w:color w:val="000000"/>
+          <w:sz w:val="24"/>
+          <w:szCs w:val="24"/>
+        </w:rPr>
+      </w:pPr>
+      <w:r>
+        <w:rPr>
+          <w:rFonts w:ascii="Times New Roman" w:hAnsi="Times New Roman" w:cs="Times New Roman"/>
+          <w:bCs/>
+          <w:iCs/>
+          <w:color w:val="000000"/>
+          <w:sz w:val="24"/>
+          <w:szCs w:val="24"/>
+        </w:rPr>
+        <w:br w:type="page"/>
+      </w:r>
     </w:p>
     <w:p>
       <w:pPr>
         <w:pStyle w:val="a3"/>
+        <w:numPr>
+          <w:ilvl w:val="0"/>
+          <w:numId w:val="1"/>
+        </w:numPr>
         <w:spacing w:line="240" w:lineRule="auto"/>
-        <w:ind w:left="-207"/>
-        <w:jc w:val="center"/>
-        <w:rPr>
-          <w:rFonts w:ascii="Times New Roman" w:hAnsi="Times New Roman" w:cs="Times New Roman"/>
-          <w:bCs/>
-          <w:iCs/>
-          <w:color w:val="000000"/>
-          <w:sz w:val="24"/>
-          <w:szCs w:val="24"/>
-        </w:rPr>
-      </w:pPr>
-    </w:p>
-    <w:p/>
+        <w:rPr>
+          <w:rFonts w:ascii="Times New Roman" w:hAnsi="Times New Roman" w:cs="Times New Roman"/>
+          <w:bCs/>
+          <w:iCs/>
+          <w:color w:val="000000"/>
+          <w:sz w:val="24"/>
+          <w:szCs w:val="24"/>
+        </w:rPr>
+      </w:pPr>
+      <w:r>
+        <w:rPr>
+          <w:rFonts w:ascii="Times New Roman" w:hAnsi="Times New Roman" w:cs="Times New Roman"/>
+          <w:bCs/>
+          <w:iCs/>
+          <w:color w:val="000000"/>
+          <w:sz w:val="24"/>
+          <w:szCs w:val="24"/>
+        </w:rPr>
+        <w:lastRenderedPageBreak/>
+        <w:t xml:space="preserve">Загрузил в удаленный </w:t>
+      </w:r>
+      <w:proofErr w:type="spellStart"/>
+      <w:r>
+        <w:rPr>
+          <w:rFonts w:ascii="Times New Roman" w:hAnsi="Times New Roman" w:cs="Times New Roman"/>
+          <w:bCs/>
+          <w:iCs/>
+          <w:color w:val="000000"/>
+          <w:sz w:val="24"/>
+          <w:szCs w:val="24"/>
+        </w:rPr>
+        <w:t>репозиторий</w:t>
+      </w:r>
+      <w:proofErr w:type="spellEnd"/>
+    </w:p>
+    <w:p>
+      <w:r>
+        <w:rPr>
+          <w:noProof/>
+          <w:lang w:eastAsia="ru-RU"/>
+        </w:rPr>
+        <w:drawing>
+          <wp:inline distT="0" distB="0" distL="0" distR="0" wp14:anchorId="37A86A4C" wp14:editId="1767AEBF">
+            <wp:extent cx="5940425" cy="3519805"/>
+            <wp:effectExtent l="0" t="0" r="3175" b="4445"/>
+            <wp:docPr id="7" name="Рисунок 7"/>
+            <wp:cNvGraphicFramePr>
+              <a:graphicFrameLocks xmlns:a="http://schemas.openxmlformats.org/drawingml/2006/main" noChangeAspect="1"/>
+            </wp:cNvGraphicFramePr>
+            <a:graphic xmlns:a="http://schemas.openxmlformats.org/drawingml/2006/main">
+              <a:graphicData uri="http://schemas.openxmlformats.org/drawingml/2006/picture">
+                <pic:pic xmlns:pic="http://schemas.openxmlformats.org/drawingml/2006/picture">
+                  <pic:nvPicPr>
+                    <pic:cNvPr id="1" name=""/>
+                    <pic:cNvPicPr/>
+                  </pic:nvPicPr>
+                  <pic:blipFill>
+                    <a:blip r:embed="rId19"/>
+                    <a:stretch>
+                      <a:fillRect/>
+                    </a:stretch>
+                  </pic:blipFill>
+                  <pic:spPr>
+                    <a:xfrm>
+                      <a:off x="0" y="0"/>
+                      <a:ext cx="5940425" cy="3519805"/>
+                    </a:xfrm>
+                    <a:prstGeom prst="rect">
+                      <a:avLst/>
+                    </a:prstGeom>
+                  </pic:spPr>
+                </pic:pic>
+              </a:graphicData>
+            </a:graphic>
+          </wp:inline>
+        </w:drawing>
+      </w:r>
+    </w:p>
+    <w:p>
+      <w:pPr>
+        <w:spacing w:line="240" w:lineRule="auto"/>
+        <w:ind w:left="-567"/>
+        <w:rPr>
+          <w:rFonts w:ascii="Times New Roman" w:hAnsi="Times New Roman" w:cs="Times New Roman"/>
+          <w:color w:val="000000"/>
+          <w:sz w:val="24"/>
+          <w:szCs w:val="24"/>
+        </w:rPr>
+      </w:pPr>
+      <w:r>
+        <w:rPr>
+          <w:rFonts w:ascii="Times New Roman" w:hAnsi="Times New Roman" w:cs="Times New Roman"/>
+          <w:b/>
+          <w:bCs/>
+          <w:color w:val="000000"/>
+          <w:sz w:val="24"/>
+          <w:szCs w:val="24"/>
+        </w:rPr>
+        <w:t>Вывод:</w:t>
+      </w:r>
+      <w:r>
+        <w:rPr>
+          <w:rFonts w:ascii="Times New Roman" w:hAnsi="Times New Roman" w:cs="Times New Roman"/>
+          <w:color w:val="000000"/>
+          <w:sz w:val="24"/>
+          <w:szCs w:val="24"/>
+        </w:rPr>
+        <w:t xml:space="preserve"> </w:t>
+      </w:r>
+    </w:p>
+    <w:p>
+      <w:pPr>
+        <w:spacing w:line="240" w:lineRule="auto"/>
+        <w:ind w:left="-567"/>
+        <w:jc w:val="both"/>
+        <w:rPr>
+          <w:rFonts w:ascii="Times New Roman" w:hAnsi="Times New Roman" w:cs="Times New Roman"/>
+          <w:sz w:val="24"/>
+          <w:szCs w:val="24"/>
+        </w:rPr>
+      </w:pPr>
+      <w:r>
+        <w:rPr>
+          <w:rFonts w:ascii="Times New Roman" w:hAnsi="Times New Roman" w:cs="Times New Roman"/>
+          <w:color w:val="000000"/>
+          <w:sz w:val="24"/>
+          <w:szCs w:val="24"/>
+        </w:rPr>
+        <w:t>В этой лабораторной работе мы поз</w:t>
+      </w:r>
+      <w:r>
+        <w:rPr>
+          <w:rFonts w:ascii="Times New Roman" w:hAnsi="Times New Roman" w:cs="Times New Roman"/>
+          <w:color w:val="000000"/>
+          <w:sz w:val="24"/>
+          <w:szCs w:val="24"/>
+        </w:rPr>
+        <w:t>наком</w:t>
+      </w:r>
+      <w:r>
+        <w:rPr>
+          <w:rFonts w:ascii="Times New Roman" w:hAnsi="Times New Roman" w:cs="Times New Roman"/>
+          <w:color w:val="000000"/>
+          <w:sz w:val="24"/>
+          <w:szCs w:val="24"/>
+        </w:rPr>
+        <w:t>ились</w:t>
+      </w:r>
+      <w:r>
+        <w:rPr>
+          <w:rFonts w:ascii="Times New Roman" w:hAnsi="Times New Roman" w:cs="Times New Roman"/>
+          <w:color w:val="000000"/>
+          <w:sz w:val="24"/>
+          <w:szCs w:val="24"/>
+        </w:rPr>
+        <w:t xml:space="preserve"> с системой контроля версий </w:t>
+      </w:r>
+      <w:proofErr w:type="spellStart"/>
+      <w:r>
+        <w:rPr>
+          <w:rFonts w:ascii="Times New Roman" w:hAnsi="Times New Roman" w:cs="Times New Roman"/>
+          <w:color w:val="000000"/>
+          <w:sz w:val="24"/>
+          <w:szCs w:val="24"/>
+        </w:rPr>
+        <w:t>git</w:t>
+      </w:r>
+      <w:proofErr w:type="spellEnd"/>
+      <w:r>
+        <w:rPr>
+          <w:rFonts w:ascii="Times New Roman" w:hAnsi="Times New Roman" w:cs="Times New Roman"/>
+          <w:color w:val="000000"/>
+          <w:sz w:val="24"/>
+          <w:szCs w:val="24"/>
+        </w:rPr>
+        <w:t>.</w:t>
+      </w:r>
+    </w:p>
+    <w:p>
+      <w:bookmarkStart w:id="0" w:name="_GoBack"/>
+      <w:bookmarkEnd w:id="0"/>
+    </w:p>
     <w:sectPr>
       <w:pgSz w:w="11906" w:h="16838"/>
       <w:pgMar w:top="1134" w:right="850" w:bottom="1134" w:left="1701" w:header="708" w:footer="708" w:gutter="0"/>

</xml_diff>